<commit_message>
feat: adicionar infográficos traduzidos (EN/PT/ES) e atualizar capítulos
- Adicionar infográficos completos em inglês, português e espanhol para capítulos 1-13
- Atualizar capítulos completos com referências e infográficos integrados
- Incluir arquivos exportados para Drive (DOCX, EPUB)
- Adicionar scripts de geração e compilação do livro master
</commit_message>
<xml_diff>
--- a/_Export_To_Drive/Chapter_10_Complete.docx
+++ b/_Export_To_Drive/Chapter_10_Complete.docx
@@ -5066,14 +5066,14 @@
       <w:r>
         <w:drawing>
           <wp:inline>
-            <wp:extent cx="3810000" cy="2540000"/>
+            <wp:extent cx="3121152" cy="3121152"/>
             <wp:effectExtent b="0" l="0" r="0" t="0"/>
             <wp:docPr descr="O Vale do Desespero" title="" id="33" name="Picture"/>
             <a:graphic>
               <a:graphicData uri="http://schemas.openxmlformats.org/drawingml/2006/picture">
                 <pic:pic>
                   <pic:nvPicPr>
-                    <pic:cNvPr descr="figures/chapter10/infographic_10_1_neuroadaptation_curve.md" id="34" name="Picture"/>
+                    <pic:cNvPr descr="figures/chapter10/neuroadaptation_curve.png" id="34" name="Picture"/>
                     <pic:cNvPicPr>
                       <a:picLocks noChangeArrowheads="1" noChangeAspect="1"/>
                     </pic:cNvPicPr>
@@ -5087,7 +5087,7 @@
                   <pic:spPr bwMode="auto">
                     <a:xfrm>
                       <a:off x="0" y="0"/>
-                      <a:ext cx="3810000" cy="2540000"/>
+                      <a:ext cx="3121152" cy="3121152"/>
                     </a:xfrm>
                     <a:prstGeom prst="rect">
                       <a:avLst/>
@@ -5161,14 +5161,14 @@
       <w:r>
         <w:drawing>
           <wp:inline>
-            <wp:extent cx="3810000" cy="2540000"/>
+            <wp:extent cx="3121152" cy="3121152"/>
             <wp:effectExtent b="0" l="0" r="0" t="0"/>
             <wp:docPr descr="Decisão: Óptico vs Neural" title="" id="37" name="Picture"/>
             <a:graphic>
               <a:graphicData uri="http://schemas.openxmlformats.org/drawingml/2006/picture">
                 <pic:pic>
                   <pic:nvPicPr>
-                    <pic:cNvPr descr="figures/chapter10/infographic_10_2_troubleshooting.md" id="38" name="Picture"/>
+                    <pic:cNvPr descr="figures/chapter10/troubleshooting.png" id="38" name="Picture"/>
                     <pic:cNvPicPr>
                       <a:picLocks noChangeArrowheads="1" noChangeAspect="1"/>
                     </pic:cNvPicPr>
@@ -5182,7 +5182,7 @@
                   <pic:spPr bwMode="auto">
                     <a:xfrm>
                       <a:off x="0" y="0"/>
-                      <a:ext cx="3810000" cy="2540000"/>
+                      <a:ext cx="3121152" cy="3121152"/>
                     </a:xfrm>
                     <a:prstGeom prst="rect">
                       <a:avLst/>
@@ -5240,14 +5240,14 @@
       <w:r>
         <w:drawing>
           <wp:inline>
-            <wp:extent cx="3810000" cy="2540000"/>
+            <wp:extent cx="3121152" cy="3121152"/>
             <wp:effectExtent b="0" l="0" r="0" t="0"/>
             <wp:docPr descr="O Acordo de Presbiopia" title="" id="41" name="Picture"/>
             <a:graphic>
               <a:graphicData uri="http://schemas.openxmlformats.org/drawingml/2006/picture">
                 <pic:pic>
                   <pic:nvPicPr>
-                    <pic:cNvPr descr="figures/chapter10/infographic_10_3_expectation_contract.md" id="42" name="Picture"/>
+                    <pic:cNvPr descr="figures/chapter10/expectation_contract.png" id="42" name="Picture"/>
                     <pic:cNvPicPr>
                       <a:picLocks noChangeArrowheads="1" noChangeAspect="1"/>
                     </pic:cNvPicPr>
@@ -5261,7 +5261,7 @@
                   <pic:spPr bwMode="auto">
                     <a:xfrm>
                       <a:off x="0" y="0"/>
-                      <a:ext cx="3810000" cy="2540000"/>
+                      <a:ext cx="3121152" cy="3121152"/>
                     </a:xfrm>
                     <a:prstGeom prst="rect">
                       <a:avLst/>

</xml_diff>